<commit_message>
Actualizacion de documento de la Gestion de Comunicacion y Seguimiento
</commit_message>
<xml_diff>
--- a/Administracion/Documentacion/ES (OPM2-16.P.TPL.v3.0.1).Plan_de_Gestion_de_la_Comunicacion.(CyberSentinel).(11-05-2026).(v.1.0.0).docx
+++ b/Administracion/Documentacion/ES (OPM2-16.P.TPL.v3.0.1).Plan_de_Gestion_de_la_Comunicacion.(CyberSentinel).(11-05-2026).(v.1.0.0).docx
@@ -22,7 +22,7 @@
           <w:noProof/>
         </w:rPr>
         <w:drawing>
-          <wp:inline distT="0" distB="0" distL="0" distR="0" wp14:anchorId="3F5954AE" wp14:editId="00C34351">
+          <wp:inline distT="0" distB="0" distL="0" distR="0" wp14:anchorId="3F5954AE" wp14:editId="19661667">
             <wp:extent cx="1238250" cy="893737"/>
             <wp:effectExtent l="0" t="0" r="0" b="1905"/>
             <wp:docPr id="2048987212" name="Imagen 4"/>
@@ -1480,7 +1480,7 @@
                     <w:color w:val="984806" w:themeColor="accent6" w:themeShade="80"/>
                     <w:sz w:val="20"/>
                   </w:rPr>
-                  <w:t xml:space="preserve">Limitada </w:t>
+                  <w:t>Limitada</w:t>
                 </w:r>
               </w:sdtContent>
             </w:sdt>
@@ -35844,58 +35844,6 @@
               <w:spacing w:before="60" w:after="60"/>
               <w:jc w:val="left"/>
               <w:rPr>
-                <w:rFonts w:ascii="Calibri" w:eastAsia="SimSun" w:hAnsi="Calibri"/>
-                <w:i/>
-                <w:iCs/>
-                <w:color w:val="1B6FB5"/>
-                <w:sz w:val="20"/>
-                <w:lang w:eastAsia="zh-CN"/>
-              </w:rPr>
-            </w:pPr>
-            <w:r>
-              <w:rPr>
-                <w:rFonts w:ascii="Calibri" w:eastAsia="SimSun" w:hAnsi="Calibri"/>
-                <w:i/>
-                <w:iCs/>
-                <w:color w:val="1B6FB5"/>
-                <w:sz w:val="20"/>
-                <w:lang w:eastAsia="zh-CN"/>
-              </w:rPr>
-              <w:t>&lt;</w:t>
-            </w:r>
-            <w:r>
-              <w:rPr>
-                <w:rFonts w:ascii="Calibri" w:eastAsia="SimSun" w:hAnsi="Calibri"/>
-                <w:i/>
-                <w:iCs/>
-                <w:color w:val="1B6FB5"/>
-                <w:sz w:val="20"/>
-                <w:lang w:eastAsia="zh-CN"/>
-              </w:rPr>
-              <w:t>Ejemplo de un documento relacionado</w:t>
-            </w:r>
-            <w:r>
-              <w:rPr>
-                <w:rFonts w:ascii="Calibri" w:eastAsia="SimSun" w:hAnsi="Calibri"/>
-                <w:i/>
-                <w:iCs/>
-                <w:color w:val="1B6FB5"/>
-                <w:sz w:val="20"/>
-                <w:lang w:eastAsia="zh-CN"/>
-              </w:rPr>
-              <w:t>&gt;</w:t>
-            </w:r>
-          </w:p>
-          <w:p>
-            <w:pPr>
-              <w:numPr>
-                <w:ilvl w:val="2"/>
-                <w:numId w:val="14"/>
-              </w:numPr>
-              <w:suppressAutoHyphens/>
-              <w:spacing w:before="60" w:after="60"/>
-              <w:jc w:val="left"/>
-              <w:rPr>
                 <w:rFonts w:ascii="Calibri" w:hAnsi="Calibri" w:cs="CG Times (W1)"/>
                 <w:color w:val="002060"/>
                 <w:kern w:val="2"/>
@@ -35906,69 +35854,11 @@
             </w:pPr>
             <w:r>
               <w:rPr>
-                <w:rFonts w:ascii="Calibri" w:eastAsia="SimSun" w:hAnsi="Calibri"/>
-                <w:i/>
-                <w:iCs/>
-                <w:color w:val="1B6FB5"/>
-                <w:sz w:val="20"/>
-                <w:lang w:eastAsia="zh-CN"/>
-              </w:rPr>
-              <w:t>&lt;04.</w:t>
-            </w:r>
-            <w:r>
-              <w:rPr>
-                <w:rFonts w:ascii="Calibri" w:eastAsia="SimSun" w:hAnsi="Calibri"/>
-                <w:i/>
-                <w:iCs/>
-                <w:color w:val="1B6FB5"/>
-                <w:sz w:val="20"/>
-                <w:lang w:eastAsia="zh-CN"/>
-              </w:rPr>
-              <w:t>Manual_del_Proyect</w:t>
-            </w:r>
-            <w:r>
-              <w:rPr>
-                <w:rFonts w:ascii="Calibri" w:eastAsia="SimSun" w:hAnsi="Calibri"/>
-                <w:i/>
-                <w:iCs/>
-                <w:color w:val="1B6FB5"/>
-                <w:sz w:val="20"/>
-                <w:lang w:eastAsia="zh-CN"/>
-              </w:rPr>
-              <w:t>o</w:t>
-            </w:r>
-            <w:r>
-              <w:rPr>
-                <w:rFonts w:ascii="Calibri" w:eastAsia="SimSun" w:hAnsi="Calibri"/>
-                <w:i/>
-                <w:iCs/>
-                <w:color w:val="1B6FB5"/>
-                <w:sz w:val="20"/>
-                <w:lang w:eastAsia="zh-CN"/>
-              </w:rPr>
-              <w:t>.XYZ.11-11-201</w:t>
-            </w:r>
-            <w:r>
-              <w:rPr>
-                <w:rFonts w:ascii="Calibri" w:eastAsia="SimSun" w:hAnsi="Calibri"/>
-                <w:i/>
-                <w:iCs/>
-                <w:color w:val="1B6FB5"/>
-                <w:sz w:val="20"/>
-                <w:lang w:eastAsia="zh-CN"/>
-              </w:rPr>
-              <w:t>7</w:t>
-            </w:r>
-            <w:r>
-              <w:rPr>
-                <w:rFonts w:ascii="Calibri" w:eastAsia="SimSun" w:hAnsi="Calibri"/>
-                <w:i/>
-                <w:iCs/>
-                <w:color w:val="1B6FB5"/>
-                <w:sz w:val="20"/>
-                <w:lang w:eastAsia="zh-CN"/>
-              </w:rPr>
-              <w:t>.V.1.0.docx&gt;</w:t>
+                <w:rFonts w:ascii="Calibri" w:hAnsi="Calibri" w:cs="CG Times (W1)"/>
+                <w:kern w:val="2"/>
+                <w:lang w:eastAsia="ar-SA"/>
+              </w:rPr>
+              <w:t>Carpeta del Proyecto</w:t>
             </w:r>
           </w:p>
         </w:tc>
@@ -36005,189 +35895,7 @@
                 <w:sz w:val="20"/>
                 <w:lang w:eastAsia="zh-CN"/>
               </w:rPr>
-              <w:t>&lt;</w:t>
-            </w:r>
-            <w:r>
-              <w:rPr>
-                <w:rFonts w:ascii="Calibri" w:eastAsia="SimSun" w:hAnsi="Calibri"/>
-                <w:i/>
-                <w:iCs/>
-                <w:color w:val="1B6FB5"/>
-                <w:sz w:val="20"/>
-                <w:lang w:eastAsia="zh-CN"/>
-              </w:rPr>
-              <w:t xml:space="preserve">Ejemplo de una </w:t>
-            </w:r>
-            <w:r>
-              <w:rPr>
-                <w:rFonts w:ascii="Calibri" w:eastAsia="SimSun" w:hAnsi="Calibri"/>
-                <w:i/>
-                <w:iCs/>
-                <w:color w:val="1B6FB5"/>
-                <w:sz w:val="20"/>
-                <w:lang w:eastAsia="zh-CN"/>
-              </w:rPr>
-              <w:t>ubicación</w:t>
-            </w:r>
-            <w:r>
-              <w:rPr>
-                <w:rFonts w:ascii="Calibri" w:eastAsia="SimSun" w:hAnsi="Calibri"/>
-                <w:i/>
-                <w:iCs/>
-                <w:color w:val="1B6FB5"/>
-                <w:sz w:val="20"/>
-                <w:lang w:eastAsia="zh-CN"/>
-              </w:rPr>
-              <w:t>&gt;</w:t>
-            </w:r>
-          </w:p>
-          <w:p>
-            <w:pPr>
-              <w:suppressAutoHyphens/>
-              <w:spacing w:before="60" w:after="60"/>
-              <w:jc w:val="left"/>
-              <w:rPr>
-                <w:rFonts w:ascii="Calibri" w:eastAsia="SimSun" w:hAnsi="Calibri"/>
-                <w:i/>
-                <w:iCs/>
-                <w:color w:val="1B6FB5"/>
-                <w:sz w:val="20"/>
-                <w:lang w:eastAsia="zh-CN"/>
-              </w:rPr>
-            </w:pPr>
-            <w:r>
-              <w:rPr>
-                <w:rFonts w:ascii="Calibri" w:eastAsia="SimSun" w:hAnsi="Calibri"/>
-                <w:i/>
-                <w:iCs/>
-                <w:color w:val="1B6FB5"/>
-                <w:sz w:val="20"/>
-                <w:lang w:eastAsia="zh-CN"/>
-              </w:rPr>
-              <w:t>&lt;</w:t>
-            </w:r>
-            <w:r>
-              <w:rPr>
-                <w:rFonts w:ascii="Calibri" w:eastAsia="SimSun" w:hAnsi="Calibri"/>
-                <w:i/>
-                <w:iCs/>
-                <w:color w:val="1B6FB5"/>
-                <w:sz w:val="20"/>
-                <w:lang w:eastAsia="zh-CN"/>
-              </w:rPr>
-              <w:t>U:\METOD</w:t>
-            </w:r>
-            <w:r>
-              <w:rPr>
-                <w:rFonts w:ascii="Calibri" w:eastAsia="SimSun" w:hAnsi="Calibri"/>
-                <w:i/>
-                <w:iCs/>
-                <w:color w:val="1B6FB5"/>
-                <w:sz w:val="20"/>
-                <w:lang w:eastAsia="zh-CN"/>
-              </w:rPr>
-              <w:t>O</w:t>
-            </w:r>
-            <w:r>
-              <w:rPr>
-                <w:rFonts w:ascii="Calibri" w:eastAsia="SimSun" w:hAnsi="Calibri"/>
-                <w:i/>
-                <w:iCs/>
-                <w:color w:val="1B6FB5"/>
-                <w:sz w:val="20"/>
-                <w:lang w:eastAsia="zh-CN"/>
-              </w:rPr>
-              <w:t>S\</w:t>
-            </w:r>
-            <w:proofErr w:type="spellStart"/>
-            <w:r>
-              <w:rPr>
-                <w:rFonts w:ascii="Calibri" w:eastAsia="SimSun" w:hAnsi="Calibri"/>
-                <w:i/>
-                <w:iCs/>
-                <w:color w:val="1B6FB5"/>
-                <w:sz w:val="20"/>
-                <w:lang w:eastAsia="zh-CN"/>
-              </w:rPr>
-              <w:t>Pro</w:t>
-            </w:r>
-            <w:r>
-              <w:rPr>
-                <w:rFonts w:ascii="Calibri" w:eastAsia="SimSun" w:hAnsi="Calibri"/>
-                <w:i/>
-                <w:iCs/>
-                <w:color w:val="1B6FB5"/>
-                <w:sz w:val="20"/>
-                <w:lang w:eastAsia="zh-CN"/>
-              </w:rPr>
-              <w:t>y</w:t>
-            </w:r>
-            <w:r>
-              <w:rPr>
-                <w:rFonts w:ascii="Calibri" w:eastAsia="SimSun" w:hAnsi="Calibri"/>
-                <w:i/>
-                <w:iCs/>
-                <w:color w:val="1B6FB5"/>
-                <w:sz w:val="20"/>
-                <w:lang w:eastAsia="zh-CN"/>
-              </w:rPr>
-              <w:t>ect</w:t>
-            </w:r>
-            <w:r>
-              <w:rPr>
-                <w:rFonts w:ascii="Calibri" w:eastAsia="SimSun" w:hAnsi="Calibri"/>
-                <w:i/>
-                <w:iCs/>
-                <w:color w:val="1B6FB5"/>
-                <w:sz w:val="20"/>
-                <w:lang w:eastAsia="zh-CN"/>
-              </w:rPr>
-              <w:t>o</w:t>
-            </w:r>
-            <w:r>
-              <w:rPr>
-                <w:rFonts w:ascii="Calibri" w:eastAsia="SimSun" w:hAnsi="Calibri"/>
-                <w:i/>
-                <w:iCs/>
-                <w:color w:val="1B6FB5"/>
-                <w:sz w:val="20"/>
-                <w:lang w:eastAsia="zh-CN"/>
-              </w:rPr>
-              <w:t>X</w:t>
-            </w:r>
-            <w:proofErr w:type="spellEnd"/>
-            <w:r>
-              <w:rPr>
-                <w:rFonts w:ascii="Calibri" w:eastAsia="SimSun" w:hAnsi="Calibri"/>
-                <w:i/>
-                <w:iCs/>
-                <w:color w:val="1B6FB5"/>
-                <w:sz w:val="20"/>
-                <w:lang w:eastAsia="zh-CN"/>
-              </w:rPr>
-              <w:t>\Document</w:t>
-            </w:r>
-            <w:r>
-              <w:rPr>
-                <w:rFonts w:ascii="Calibri" w:eastAsia="SimSun" w:hAnsi="Calibri"/>
-                <w:i/>
-                <w:iCs/>
-                <w:color w:val="1B6FB5"/>
-                <w:sz w:val="20"/>
-                <w:lang w:eastAsia="zh-CN"/>
-              </w:rPr>
-              <w:t>o</w:t>
-            </w:r>
-            <w:r>
-              <w:rPr>
-                <w:rFonts w:ascii="Calibri" w:eastAsia="SimSun" w:hAnsi="Calibri"/>
-                <w:i/>
-                <w:iCs/>
-                <w:color w:val="1B6FB5"/>
-                <w:sz w:val="20"/>
-                <w:lang w:eastAsia="zh-CN"/>
-              </w:rPr>
-              <w:t>s\&gt;</w:t>
+              <w:t>https://github.com/KevinDCCsHeOs/CyberSentinel/tree/7fcdaa9a1628e82e9bf6723ae86b4875f628f297/Administracion</w:t>
             </w:r>
           </w:p>
         </w:tc>
@@ -36242,20 +35950,48 @@
               <w:jc w:val="left"/>
               <w:rPr>
                 <w:rFonts w:ascii="Calibri" w:eastAsia="SimSun" w:hAnsi="Calibri"/>
-                <w:i/>
-                <w:iCs/>
+                <w:color w:val="1B6FB5"/>
+                <w:sz w:val="20"/>
+                <w:lang w:val="es-419" w:eastAsia="zh-CN"/>
+              </w:rPr>
+            </w:pPr>
+            <w:r>
+              <w:rPr>
+                <w:rFonts w:ascii="Calibri" w:eastAsia="SimSun" w:hAnsi="Calibri"/>
                 <w:color w:val="1B6FB5"/>
                 <w:sz w:val="20"/>
                 <w:lang w:eastAsia="zh-CN"/>
               </w:rPr>
-            </w:pPr>
-            <w:r>
-              <w:rPr>
-                <w:rFonts w:ascii="Calibri" w:hAnsi="Calibri" w:cs="CG Times (W1)"/>
-                <w:kern w:val="2"/>
-                <w:lang w:eastAsia="ar-SA"/>
-              </w:rPr>
-              <w:t>Carpeta del Proyecto</w:t>
+              <w:t xml:space="preserve">Acta de </w:t>
+            </w:r>
+            <w:proofErr w:type="spellStart"/>
+            <w:r>
+              <w:rPr>
+                <w:rFonts w:ascii="Calibri" w:eastAsia="SimSun" w:hAnsi="Calibri"/>
+                <w:color w:val="1B6FB5"/>
+                <w:sz w:val="20"/>
+                <w:lang w:eastAsia="zh-CN"/>
+              </w:rPr>
+              <w:t>Constituci</w:t>
+            </w:r>
+            <w:r>
+              <w:rPr>
+                <w:rFonts w:ascii="Calibri" w:eastAsia="SimSun" w:hAnsi="Calibri"/>
+                <w:color w:val="1B6FB5"/>
+                <w:sz w:val="20"/>
+                <w:lang w:val="es-419" w:eastAsia="zh-CN"/>
+              </w:rPr>
+              <w:t>ón</w:t>
+            </w:r>
+            <w:proofErr w:type="spellEnd"/>
+            <w:r>
+              <w:rPr>
+                <w:rFonts w:ascii="Calibri" w:eastAsia="SimSun" w:hAnsi="Calibri"/>
+                <w:color w:val="1B6FB5"/>
+                <w:sz w:val="20"/>
+                <w:lang w:val="es-419" w:eastAsia="zh-CN"/>
+              </w:rPr>
+              <w:t xml:space="preserve"> del Proyecto</w:t>
             </w:r>
           </w:p>
         </w:tc>
@@ -36291,7 +36027,7 @@
                 <w:sz w:val="20"/>
                 <w:lang w:eastAsia="zh-CN"/>
               </w:rPr>
-              <w:t>&lt;</w:t>
+              <w:t>https://github.com/KevinDCCsHeOs/CyberSentinel/blob/7fcdaa9a1628e82e9bf6723ae86b4875f628f297/Administracion/Documentacion/ES%20(OPM2-03.I.TPL.v3.0.1).Acta_de_Constituci%C3%B3n_del_Proyecto.(CyberSentinel).(06-03-2026).(v1.0.0)%20SUBRAYADA.docx</w:t>
             </w:r>
             <w:r>
               <w:rPr>
@@ -36302,51 +36038,7 @@
                 <w:sz w:val="20"/>
                 <w:lang w:eastAsia="zh-CN"/>
               </w:rPr>
-              <w:t xml:space="preserve">Inserte </w:t>
-            </w:r>
-            <w:r>
-              <w:rPr>
-                <w:rFonts w:ascii="Calibri" w:eastAsia="SimSun" w:hAnsi="Calibri"/>
-                <w:i/>
-                <w:iCs/>
-                <w:color w:val="1B6FB5"/>
-                <w:sz w:val="20"/>
-                <w:lang w:eastAsia="zh-CN"/>
-              </w:rPr>
-              <w:t>ubicación</w:t>
-            </w:r>
-            <w:r>
-              <w:rPr>
-                <w:rFonts w:ascii="Calibri" w:eastAsia="SimSun" w:hAnsi="Calibri"/>
-                <w:i/>
-                <w:iCs/>
-                <w:color w:val="1B6FB5"/>
-                <w:sz w:val="20"/>
-                <w:lang w:eastAsia="zh-CN"/>
-              </w:rPr>
               <w:t xml:space="preserve"> </w:t>
-            </w:r>
-            <w:r>
-              <w:rPr>
-                <w:rFonts w:ascii="Calibri" w:eastAsia="SimSun" w:hAnsi="Calibri"/>
-                <w:i/>
-                <w:iCs/>
-                <w:color w:val="1B6FB5"/>
-                <w:sz w:val="20"/>
-                <w:lang w:eastAsia="zh-CN"/>
-              </w:rPr>
-              <w:t>de la carpeta del proyecto</w:t>
-            </w:r>
-            <w:r>
-              <w:rPr>
-                <w:rFonts w:ascii="Calibri" w:eastAsia="SimSun" w:hAnsi="Calibri"/>
-                <w:i/>
-                <w:iCs/>
-                <w:color w:val="1B6FB5"/>
-                <w:sz w:val="20"/>
-                <w:lang w:eastAsia="zh-CN"/>
-              </w:rPr>
-              <w:t>.&gt;</w:t>
             </w:r>
           </w:p>
         </w:tc>
@@ -36407,6 +36099,16 @@
                 <w:lang w:eastAsia="ar-SA"/>
               </w:rPr>
             </w:pPr>
+            <w:r>
+              <w:rPr>
+                <w:rFonts w:ascii="Calibri" w:hAnsi="Calibri" w:cs="CG Times (W1)"/>
+                <w:color w:val="002060"/>
+                <w:kern w:val="2"/>
+                <w:u w:val="single"/>
+                <w:lang w:eastAsia="ar-SA"/>
+              </w:rPr>
+              <w:t>EDT (Plan de Trabajo)</w:t>
+            </w:r>
           </w:p>
         </w:tc>
         <w:tc>
@@ -36431,6 +36133,467 @@
                 <w:lang w:eastAsia="ar-SA"/>
               </w:rPr>
             </w:pPr>
+            <w:hyperlink r:id="rId21" w:history="1">
+              <w:r>
+                <w:rPr>
+                  <w:rStyle w:val="Hipervnculo"/>
+                  <w:rFonts w:ascii="Calibri" w:hAnsi="Calibri" w:cs="CG Times (W1)"/>
+                  <w:kern w:val="2"/>
+                  <w:lang w:eastAsia="ar-SA"/>
+                </w:rPr>
+                <w:t>https://github.com/KevinDCCsHeOs/CyberSentinel/blob/7fcdaa9a1628e82e9bf6723ae86b4875f628f297/Administracion/Documentacion/ES%20(OPM2-06.P.TPL.v3.0.1).Plan_de_Trabajo_del_Proyecto.(CyberSentinel).(20-03-2026).(v.1.0.0).docx</w:t>
+              </w:r>
+            </w:hyperlink>
+          </w:p>
+          <w:p>
+            <w:pPr>
+              <w:suppressAutoHyphens/>
+              <w:spacing w:before="60" w:after="60"/>
+              <w:rPr>
+                <w:rFonts w:ascii="Calibri" w:hAnsi="Calibri" w:cs="CG Times (W1)"/>
+                <w:color w:val="002060"/>
+                <w:kern w:val="2"/>
+                <w:u w:val="single"/>
+                <w:lang w:eastAsia="ar-SA"/>
+              </w:rPr>
+            </w:pPr>
+            <w:hyperlink r:id="rId22" w:history="1">
+              <w:r>
+                <w:rPr>
+                  <w:rStyle w:val="Hipervnculo"/>
+                  <w:rFonts w:ascii="Calibri" w:hAnsi="Calibri" w:cs="CG Times (W1)"/>
+                  <w:kern w:val="2"/>
+                  <w:lang w:eastAsia="ar-SA"/>
+                </w:rPr>
+                <w:t>https://github.com/KevinDCCsHeOs/CyberSentinel/blob/7fcdaa9a1628e82e9bf6723ae86b4875f628f297/Administracion/Documentacion/CyberSentinel-EDT2.drawio</w:t>
+              </w:r>
+            </w:hyperlink>
+          </w:p>
+        </w:tc>
+      </w:tr>
+      <w:tr>
+        <w:tc>
+          <w:tcPr>
+            <w:tcW w:w="421" w:type="pct"/>
+            <w:tcBorders>
+              <w:top w:val="single" w:sz="4" w:space="0" w:color="BFBFBF"/>
+              <w:left w:val="single" w:sz="4" w:space="0" w:color="BFBFBF"/>
+              <w:bottom w:val="single" w:sz="4" w:space="0" w:color="BFBFBF"/>
+              <w:right w:val="single" w:sz="4" w:space="0" w:color="BFBFBF"/>
+            </w:tcBorders>
+          </w:tcPr>
+          <w:p>
+            <w:pPr>
+              <w:suppressAutoHyphens/>
+              <w:spacing w:before="60" w:after="60"/>
+              <w:rPr>
+                <w:rFonts w:ascii="Calibri" w:hAnsi="Calibri" w:cs="CG Times (W1)"/>
+                <w:color w:val="000000"/>
+                <w:kern w:val="2"/>
+                <w:lang w:eastAsia="ar-SA"/>
+              </w:rPr>
+            </w:pPr>
+            <w:r>
+              <w:rPr>
+                <w:rFonts w:ascii="Calibri" w:hAnsi="Calibri" w:cs="CG Times (W1)"/>
+                <w:color w:val="000000"/>
+                <w:kern w:val="2"/>
+                <w:lang w:eastAsia="ar-SA"/>
+              </w:rPr>
+              <w:t>4</w:t>
+            </w:r>
+          </w:p>
+        </w:tc>
+        <w:tc>
+          <w:tcPr>
+            <w:tcW w:w="2106" w:type="pct"/>
+            <w:tcBorders>
+              <w:top w:val="single" w:sz="4" w:space="0" w:color="BFBFBF"/>
+              <w:left w:val="single" w:sz="4" w:space="0" w:color="BFBFBF"/>
+              <w:bottom w:val="single" w:sz="4" w:space="0" w:color="BFBFBF"/>
+              <w:right w:val="single" w:sz="4" w:space="0" w:color="BFBFBF"/>
+            </w:tcBorders>
+          </w:tcPr>
+          <w:p>
+            <w:pPr>
+              <w:suppressAutoHyphens/>
+              <w:spacing w:before="60" w:after="60"/>
+              <w:jc w:val="left"/>
+              <w:rPr>
+                <w:rFonts w:ascii="Calibri" w:hAnsi="Calibri" w:cs="CG Times (W1)"/>
+                <w:color w:val="002060"/>
+                <w:kern w:val="2"/>
+                <w:u w:val="single"/>
+                <w:lang w:eastAsia="ar-SA"/>
+              </w:rPr>
+            </w:pPr>
+            <w:r>
+              <w:rPr>
+                <w:rFonts w:ascii="Calibri" w:hAnsi="Calibri" w:cs="CG Times (W1)"/>
+                <w:color w:val="002060"/>
+                <w:kern w:val="2"/>
+                <w:u w:val="single"/>
+                <w:lang w:eastAsia="ar-SA"/>
+              </w:rPr>
+              <w:t>Grafica de Gantt</w:t>
+            </w:r>
+          </w:p>
+        </w:tc>
+        <w:tc>
+          <w:tcPr>
+            <w:tcW w:w="2473" w:type="pct"/>
+            <w:tcBorders>
+              <w:top w:val="single" w:sz="4" w:space="0" w:color="BFBFBF"/>
+              <w:left w:val="single" w:sz="4" w:space="0" w:color="BFBFBF"/>
+              <w:bottom w:val="single" w:sz="4" w:space="0" w:color="BFBFBF"/>
+              <w:right w:val="single" w:sz="4" w:space="0" w:color="BFBFBF"/>
+            </w:tcBorders>
+          </w:tcPr>
+          <w:p>
+            <w:pPr>
+              <w:suppressAutoHyphens/>
+              <w:spacing w:before="60" w:after="60"/>
+              <w:rPr>
+                <w:rFonts w:ascii="Calibri" w:hAnsi="Calibri" w:cs="CG Times (W1)"/>
+                <w:color w:val="002060"/>
+                <w:kern w:val="2"/>
+                <w:u w:val="single"/>
+                <w:lang w:eastAsia="ar-SA"/>
+              </w:rPr>
+            </w:pPr>
+            <w:hyperlink r:id="rId23" w:history="1">
+              <w:r>
+                <w:rPr>
+                  <w:rStyle w:val="Hipervnculo"/>
+                  <w:rFonts w:ascii="Calibri" w:hAnsi="Calibri" w:cs="CG Times (W1)"/>
+                  <w:kern w:val="2"/>
+                  <w:lang w:eastAsia="ar-SA"/>
+                </w:rPr>
+                <w:t>https://github.com/KevinDCCsHeOs/CyberSentinel/blob/7fcdaa9a1628e82e9bf6723ae86b4875f628f297/Administracion/Documentacion/GraficaDeGantt.mpp</w:t>
+              </w:r>
+            </w:hyperlink>
+          </w:p>
+        </w:tc>
+      </w:tr>
+      <w:tr>
+        <w:tc>
+          <w:tcPr>
+            <w:tcW w:w="421" w:type="pct"/>
+            <w:tcBorders>
+              <w:top w:val="single" w:sz="4" w:space="0" w:color="BFBFBF"/>
+              <w:left w:val="single" w:sz="4" w:space="0" w:color="BFBFBF"/>
+              <w:bottom w:val="single" w:sz="4" w:space="0" w:color="BFBFBF"/>
+              <w:right w:val="single" w:sz="4" w:space="0" w:color="BFBFBF"/>
+            </w:tcBorders>
+          </w:tcPr>
+          <w:p>
+            <w:pPr>
+              <w:suppressAutoHyphens/>
+              <w:spacing w:before="60" w:after="60"/>
+              <w:rPr>
+                <w:rFonts w:ascii="Calibri" w:hAnsi="Calibri" w:cs="CG Times (W1)"/>
+                <w:color w:val="000000"/>
+                <w:kern w:val="2"/>
+                <w:lang w:eastAsia="ar-SA"/>
+              </w:rPr>
+            </w:pPr>
+            <w:r>
+              <w:rPr>
+                <w:rFonts w:ascii="Calibri" w:hAnsi="Calibri" w:cs="CG Times (W1)"/>
+                <w:color w:val="000000"/>
+                <w:kern w:val="2"/>
+                <w:lang w:eastAsia="ar-SA"/>
+              </w:rPr>
+              <w:t>5</w:t>
+            </w:r>
+          </w:p>
+        </w:tc>
+        <w:tc>
+          <w:tcPr>
+            <w:tcW w:w="2106" w:type="pct"/>
+            <w:tcBorders>
+              <w:top w:val="single" w:sz="4" w:space="0" w:color="BFBFBF"/>
+              <w:left w:val="single" w:sz="4" w:space="0" w:color="BFBFBF"/>
+              <w:bottom w:val="single" w:sz="4" w:space="0" w:color="BFBFBF"/>
+              <w:right w:val="single" w:sz="4" w:space="0" w:color="BFBFBF"/>
+            </w:tcBorders>
+          </w:tcPr>
+          <w:p>
+            <w:pPr>
+              <w:suppressAutoHyphens/>
+              <w:spacing w:before="60" w:after="60"/>
+              <w:jc w:val="left"/>
+              <w:rPr>
+                <w:rFonts w:ascii="Calibri" w:hAnsi="Calibri" w:cs="CG Times (W1)"/>
+                <w:color w:val="002060"/>
+                <w:kern w:val="2"/>
+                <w:u w:val="single"/>
+                <w:lang w:eastAsia="ar-SA"/>
+              </w:rPr>
+            </w:pPr>
+            <w:r>
+              <w:rPr>
+                <w:rFonts w:ascii="Calibri" w:hAnsi="Calibri" w:cs="CG Times (W1)"/>
+                <w:color w:val="002060"/>
+                <w:kern w:val="2"/>
+                <w:u w:val="single"/>
+                <w:lang w:eastAsia="ar-SA"/>
+              </w:rPr>
+              <w:t>Análisis de Riesgos</w:t>
+            </w:r>
+          </w:p>
+        </w:tc>
+        <w:tc>
+          <w:tcPr>
+            <w:tcW w:w="2473" w:type="pct"/>
+            <w:tcBorders>
+              <w:top w:val="single" w:sz="4" w:space="0" w:color="BFBFBF"/>
+              <w:left w:val="single" w:sz="4" w:space="0" w:color="BFBFBF"/>
+              <w:bottom w:val="single" w:sz="4" w:space="0" w:color="BFBFBF"/>
+              <w:right w:val="single" w:sz="4" w:space="0" w:color="BFBFBF"/>
+            </w:tcBorders>
+          </w:tcPr>
+          <w:p>
+            <w:pPr>
+              <w:suppressAutoHyphens/>
+              <w:spacing w:before="60" w:after="60"/>
+              <w:rPr>
+                <w:rFonts w:ascii="Calibri" w:hAnsi="Calibri" w:cs="CG Times (W1)"/>
+                <w:color w:val="002060"/>
+                <w:kern w:val="2"/>
+                <w:u w:val="single"/>
+                <w:lang w:eastAsia="ar-SA"/>
+              </w:rPr>
+            </w:pPr>
+            <w:hyperlink r:id="rId24" w:history="1">
+              <w:r>
+                <w:rPr>
+                  <w:rStyle w:val="Hipervnculo"/>
+                  <w:rFonts w:ascii="Calibri" w:hAnsi="Calibri" w:cs="CG Times (W1)"/>
+                  <w:kern w:val="2"/>
+                  <w:lang w:eastAsia="ar-SA"/>
+                </w:rPr>
+                <w:t>https://github.com/KevinDCCsHeOs/CyberSentinel/blob/7fcdaa9a1628e82e9bf6723ae86b4875f628f297/Administracion/Documentacion/2A.-%20Riesgos_Boehm.xlsx</w:t>
+              </w:r>
+            </w:hyperlink>
+          </w:p>
+        </w:tc>
+      </w:tr>
+      <w:tr>
+        <w:tc>
+          <w:tcPr>
+            <w:tcW w:w="421" w:type="pct"/>
+            <w:tcBorders>
+              <w:top w:val="single" w:sz="4" w:space="0" w:color="BFBFBF"/>
+              <w:left w:val="single" w:sz="4" w:space="0" w:color="BFBFBF"/>
+              <w:bottom w:val="single" w:sz="4" w:space="0" w:color="BFBFBF"/>
+              <w:right w:val="single" w:sz="4" w:space="0" w:color="BFBFBF"/>
+            </w:tcBorders>
+          </w:tcPr>
+          <w:p>
+            <w:pPr>
+              <w:suppressAutoHyphens/>
+              <w:spacing w:before="60" w:after="60"/>
+              <w:rPr>
+                <w:rFonts w:ascii="Calibri" w:hAnsi="Calibri" w:cs="CG Times (W1)"/>
+                <w:color w:val="000000"/>
+                <w:kern w:val="2"/>
+                <w:lang w:eastAsia="ar-SA"/>
+              </w:rPr>
+            </w:pPr>
+            <w:r>
+              <w:rPr>
+                <w:rFonts w:ascii="Calibri" w:hAnsi="Calibri" w:cs="CG Times (W1)"/>
+                <w:color w:val="000000"/>
+                <w:kern w:val="2"/>
+                <w:lang w:eastAsia="ar-SA"/>
+              </w:rPr>
+              <w:t>6</w:t>
+            </w:r>
+          </w:p>
+        </w:tc>
+        <w:tc>
+          <w:tcPr>
+            <w:tcW w:w="2106" w:type="pct"/>
+            <w:tcBorders>
+              <w:top w:val="single" w:sz="4" w:space="0" w:color="BFBFBF"/>
+              <w:left w:val="single" w:sz="4" w:space="0" w:color="BFBFBF"/>
+              <w:bottom w:val="single" w:sz="4" w:space="0" w:color="BFBFBF"/>
+              <w:right w:val="single" w:sz="4" w:space="0" w:color="BFBFBF"/>
+            </w:tcBorders>
+          </w:tcPr>
+          <w:p>
+            <w:pPr>
+              <w:suppressAutoHyphens/>
+              <w:spacing w:before="60" w:after="60"/>
+              <w:jc w:val="left"/>
+              <w:rPr>
+                <w:rFonts w:ascii="Calibri" w:hAnsi="Calibri" w:cs="CG Times (W1)"/>
+                <w:color w:val="002060"/>
+                <w:kern w:val="2"/>
+                <w:u w:val="single"/>
+                <w:lang w:eastAsia="ar-SA"/>
+              </w:rPr>
+            </w:pPr>
+            <w:r>
+              <w:rPr>
+                <w:rFonts w:ascii="Calibri" w:hAnsi="Calibri" w:cs="CG Times (W1)"/>
+                <w:color w:val="002060"/>
+                <w:kern w:val="2"/>
+                <w:u w:val="single"/>
+                <w:lang w:eastAsia="ar-SA"/>
+              </w:rPr>
+              <w:t>Personal Requerido</w:t>
+            </w:r>
+          </w:p>
+        </w:tc>
+        <w:tc>
+          <w:tcPr>
+            <w:tcW w:w="2473" w:type="pct"/>
+            <w:tcBorders>
+              <w:top w:val="single" w:sz="4" w:space="0" w:color="BFBFBF"/>
+              <w:left w:val="single" w:sz="4" w:space="0" w:color="BFBFBF"/>
+              <w:bottom w:val="single" w:sz="4" w:space="0" w:color="BFBFBF"/>
+              <w:right w:val="single" w:sz="4" w:space="0" w:color="BFBFBF"/>
+            </w:tcBorders>
+          </w:tcPr>
+          <w:p>
+            <w:pPr>
+              <w:suppressAutoHyphens/>
+              <w:spacing w:before="60" w:after="60"/>
+              <w:rPr>
+                <w:rFonts w:ascii="Calibri" w:hAnsi="Calibri" w:cs="CG Times (W1)"/>
+                <w:color w:val="002060"/>
+                <w:kern w:val="2"/>
+                <w:u w:val="single"/>
+                <w:lang w:eastAsia="ar-SA"/>
+              </w:rPr>
+            </w:pPr>
+            <w:hyperlink r:id="rId25" w:history="1">
+              <w:r>
+                <w:rPr>
+                  <w:rStyle w:val="Hipervnculo"/>
+                  <w:rFonts w:ascii="Calibri" w:hAnsi="Calibri" w:cs="CG Times (W1)"/>
+                  <w:kern w:val="2"/>
+                  <w:lang w:eastAsia="ar-SA"/>
+                </w:rPr>
+                <w:t>https://github.com/KevinDCCsHeOs/CyberSentinel/blob/7fcdaa9a1628e82e9bf6723ae86b4875f628f297/Administracion/Documentacion/Tama%C3%B1oDelSoftware.xlsx</w:t>
+              </w:r>
+            </w:hyperlink>
+          </w:p>
+        </w:tc>
+      </w:tr>
+      <w:tr>
+        <w:tc>
+          <w:tcPr>
+            <w:tcW w:w="421" w:type="pct"/>
+            <w:tcBorders>
+              <w:top w:val="single" w:sz="4" w:space="0" w:color="BFBFBF"/>
+              <w:left w:val="single" w:sz="4" w:space="0" w:color="BFBFBF"/>
+              <w:bottom w:val="single" w:sz="4" w:space="0" w:color="BFBFBF"/>
+              <w:right w:val="single" w:sz="4" w:space="0" w:color="BFBFBF"/>
+            </w:tcBorders>
+          </w:tcPr>
+          <w:p>
+            <w:pPr>
+              <w:suppressAutoHyphens/>
+              <w:spacing w:before="60" w:after="60"/>
+              <w:rPr>
+                <w:rFonts w:ascii="Calibri" w:hAnsi="Calibri" w:cs="CG Times (W1)"/>
+                <w:color w:val="000000"/>
+                <w:kern w:val="2"/>
+                <w:lang w:eastAsia="ar-SA"/>
+              </w:rPr>
+            </w:pPr>
+            <w:r>
+              <w:rPr>
+                <w:rFonts w:ascii="Calibri" w:hAnsi="Calibri" w:cs="CG Times (W1)"/>
+                <w:color w:val="000000"/>
+                <w:kern w:val="2"/>
+                <w:lang w:eastAsia="ar-SA"/>
+              </w:rPr>
+              <w:t>7</w:t>
+            </w:r>
+          </w:p>
+        </w:tc>
+        <w:tc>
+          <w:tcPr>
+            <w:tcW w:w="2106" w:type="pct"/>
+            <w:tcBorders>
+              <w:top w:val="single" w:sz="4" w:space="0" w:color="BFBFBF"/>
+              <w:left w:val="single" w:sz="4" w:space="0" w:color="BFBFBF"/>
+              <w:bottom w:val="single" w:sz="4" w:space="0" w:color="BFBFBF"/>
+              <w:right w:val="single" w:sz="4" w:space="0" w:color="BFBFBF"/>
+            </w:tcBorders>
+          </w:tcPr>
+          <w:p>
+            <w:pPr>
+              <w:suppressAutoHyphens/>
+              <w:spacing w:before="60" w:after="60"/>
+              <w:jc w:val="left"/>
+              <w:rPr>
+                <w:rFonts w:ascii="Calibri" w:hAnsi="Calibri" w:cs="CG Times (W1)"/>
+                <w:color w:val="002060"/>
+                <w:kern w:val="2"/>
+                <w:u w:val="single"/>
+                <w:lang w:eastAsia="ar-SA"/>
+              </w:rPr>
+            </w:pPr>
+            <w:r>
+              <w:rPr>
+                <w:rFonts w:ascii="Calibri" w:hAnsi="Calibri" w:cs="CG Times (W1)"/>
+                <w:color w:val="002060"/>
+                <w:kern w:val="2"/>
+                <w:u w:val="single"/>
+                <w:lang w:eastAsia="ar-SA"/>
+              </w:rPr>
+              <w:t>Documento de Políticas de Comunicación y Seguimiento</w:t>
+            </w:r>
+          </w:p>
+        </w:tc>
+        <w:tc>
+          <w:tcPr>
+            <w:tcW w:w="2473" w:type="pct"/>
+            <w:tcBorders>
+              <w:top w:val="single" w:sz="4" w:space="0" w:color="BFBFBF"/>
+              <w:left w:val="single" w:sz="4" w:space="0" w:color="BFBFBF"/>
+              <w:bottom w:val="single" w:sz="4" w:space="0" w:color="BFBFBF"/>
+              <w:right w:val="single" w:sz="4" w:space="0" w:color="BFBFBF"/>
+            </w:tcBorders>
+          </w:tcPr>
+          <w:p>
+            <w:pPr>
+              <w:suppressAutoHyphens/>
+              <w:spacing w:before="60" w:after="60"/>
+              <w:rPr>
+                <w:rFonts w:ascii="Calibri" w:hAnsi="Calibri" w:cs="CG Times (W1)"/>
+                <w:color w:val="002060"/>
+                <w:kern w:val="2"/>
+                <w:u w:val="single"/>
+                <w:lang w:eastAsia="ar-SA"/>
+              </w:rPr>
+            </w:pPr>
+            <w:r>
+              <w:rPr>
+                <w:rFonts w:ascii="Calibri" w:hAnsi="Calibri" w:cs="CG Times (W1)"/>
+                <w:color w:val="002060"/>
+                <w:kern w:val="2"/>
+                <w:u w:val="single"/>
+                <w:lang w:eastAsia="ar-SA"/>
+              </w:rPr>
+              <w:t>https://github.com/KevinDCCsHeOs/CyberSentinel/blob/7fcdaa9a1628e82e9bf6723ae86b4875f628f297/Administracion/Documentacion/ES%20(OPM2-16.P.TPL.v3.0.1).Plan_de_Gestion_de_la_Comunicacion.(CyberSentinel).(11</w:t>
+            </w:r>
+            <w:r>
+              <w:rPr>
+                <w:rFonts w:ascii="Calibri" w:hAnsi="Calibri" w:cs="CG Times (W1)"/>
+                <w:color w:val="002060"/>
+                <w:kern w:val="2"/>
+                <w:u w:val="single"/>
+                <w:lang w:eastAsia="ar-SA"/>
+              </w:rPr>
+              <w:lastRenderedPageBreak/>
+              <w:t>-05-2026).(v.1.0.0).docx</w:t>
+            </w:r>
           </w:p>
         </w:tc>
       </w:tr>
@@ -36450,10 +36613,10 @@
       </w:pPr>
     </w:p>
     <w:sectPr>
-      <w:headerReference w:type="even" r:id="rId21"/>
-      <w:headerReference w:type="default" r:id="rId22"/>
-      <w:footerReference w:type="default" r:id="rId23"/>
-      <w:headerReference w:type="first" r:id="rId24"/>
+      <w:headerReference w:type="even" r:id="rId26"/>
+      <w:headerReference w:type="default" r:id="rId27"/>
+      <w:footerReference w:type="default" r:id="rId28"/>
+      <w:headerReference w:type="first" r:id="rId29"/>
       <w:pgSz w:w="16840" w:h="11907" w:orient="landscape" w:code="9"/>
       <w:pgMar w:top="1242" w:right="1440" w:bottom="992" w:left="1440" w:header="601" w:footer="476" w:gutter="0"/>
       <w:cols w:space="709"/>
@@ -37257,8 +37420,39 @@
             <w:sz w:val="18"/>
             <w:szCs w:val="18"/>
           </w:rPr>
-          <w:t xml:space="preserve"> for SMEs</w:t>
+          <w:t xml:space="preserve"> </w:t>
         </w:r>
+        <w:proofErr w:type="spellStart"/>
+        <w:r>
+          <w:rPr>
+            <w:rFonts w:asciiTheme="minorHAnsi" w:eastAsia="PMingLiU" w:hAnsiTheme="minorHAnsi" w:cstheme="minorHAnsi"/>
+            <w:color w:val="984806" w:themeColor="accent6" w:themeShade="80"/>
+            <w:sz w:val="18"/>
+            <w:szCs w:val="18"/>
+          </w:rPr>
+          <w:t>for</w:t>
+        </w:r>
+        <w:proofErr w:type="spellEnd"/>
+        <w:r>
+          <w:rPr>
+            <w:rFonts w:asciiTheme="minorHAnsi" w:eastAsia="PMingLiU" w:hAnsiTheme="minorHAnsi" w:cstheme="minorHAnsi"/>
+            <w:color w:val="984806" w:themeColor="accent6" w:themeShade="80"/>
+            <w:sz w:val="18"/>
+            <w:szCs w:val="18"/>
+          </w:rPr>
+          <w:t xml:space="preserve"> </w:t>
+        </w:r>
+        <w:proofErr w:type="spellStart"/>
+        <w:r>
+          <w:rPr>
+            <w:rFonts w:asciiTheme="minorHAnsi" w:eastAsia="PMingLiU" w:hAnsiTheme="minorHAnsi" w:cstheme="minorHAnsi"/>
+            <w:color w:val="984806" w:themeColor="accent6" w:themeShade="80"/>
+            <w:sz w:val="18"/>
+            <w:szCs w:val="18"/>
+          </w:rPr>
+          <w:t>SMEs</w:t>
+        </w:r>
+        <w:proofErr w:type="spellEnd"/>
       </w:sdtContent>
     </w:sdt>
     <w:r>
@@ -37418,8 +37612,20 @@
             <w:szCs w:val="18"/>
             <w:lang w:val="fr-BE"/>
           </w:rPr>
-          <w:t xml:space="preserve"> Platform for SMEs</w:t>
+          <w:t xml:space="preserve"> Platform for </w:t>
         </w:r>
+        <w:proofErr w:type="spellStart"/>
+        <w:r>
+          <w:rPr>
+            <w:rFonts w:asciiTheme="minorHAnsi" w:hAnsiTheme="minorHAnsi" w:cstheme="minorHAnsi"/>
+            <w:color w:val="984806" w:themeColor="accent6" w:themeShade="80"/>
+            <w:sz w:val="18"/>
+            <w:szCs w:val="18"/>
+            <w:lang w:val="fr-BE"/>
+          </w:rPr>
+          <w:t>SMEs</w:t>
+        </w:r>
+        <w:proofErr w:type="spellEnd"/>
       </w:sdtContent>
     </w:sdt>
     <w:r>
@@ -46468,6 +46674,18 @@
       </w:tcPr>
     </w:tblStylePr>
   </w:style>
+  <w:style w:type="character" w:styleId="Mencinsinresolver">
+    <w:name w:val="Unresolved Mention"/>
+    <w:basedOn w:val="Fuentedeprrafopredeter"/>
+    <w:uiPriority w:val="99"/>
+    <w:semiHidden/>
+    <w:unhideWhenUsed/>
+    <w:rsid w:val="00762874"/>
+    <w:rPr>
+      <w:color w:val="605E5C"/>
+      <w:shd w:val="clear" w:color="auto" w:fill="E1DFDD"/>
+    </w:rPr>
+  </w:style>
 </w:styles>
 </file>
 
@@ -46839,6 +47057,7 @@
     <w:rsid w:val="004B48E8"/>
     <w:rsid w:val="004C219A"/>
     <w:rsid w:val="00512AC7"/>
+    <w:rsid w:val="00532D79"/>
     <w:rsid w:val="00586907"/>
     <w:rsid w:val="00602809"/>
     <w:rsid w:val="00620951"/>
@@ -46859,9 +47078,11 @@
     <w:rsid w:val="00B922CB"/>
     <w:rsid w:val="00BB2A33"/>
     <w:rsid w:val="00BF797A"/>
+    <w:rsid w:val="00C15415"/>
     <w:rsid w:val="00C16231"/>
     <w:rsid w:val="00C3027C"/>
     <w:rsid w:val="00C32923"/>
+    <w:rsid w:val="00C64AAE"/>
     <w:rsid w:val="00C96012"/>
     <w:rsid w:val="00CD5AF0"/>
     <w:rsid w:val="00CE2233"/>
@@ -47330,48 +47551,6 @@
       <w:color w:val="808080"/>
     </w:rPr>
   </w:style>
-  <w:style w:type="paragraph" w:customStyle="1" w:styleId="7387685FAD0848C98EAE3BF3CCBB0C85">
-    <w:name w:val="7387685FAD0848C98EAE3BF3CCBB0C85"/>
-    <w:rsid w:val="00F9701E"/>
-    <w:pPr>
-      <w:spacing w:after="160" w:line="278" w:lineRule="auto"/>
-    </w:pPr>
-    <w:rPr>
-      <w:kern w:val="2"/>
-      <w:sz w:val="24"/>
-      <w:szCs w:val="24"/>
-      <w:lang w:val="es-MX" w:eastAsia="es-MX"/>
-      <w14:ligatures w14:val="standardContextual"/>
-    </w:rPr>
-  </w:style>
-  <w:style w:type="paragraph" w:customStyle="1" w:styleId="AE69E72F590445C496E3D6040FA99FBD">
-    <w:name w:val="AE69E72F590445C496E3D6040FA99FBD"/>
-    <w:rsid w:val="00F9701E"/>
-    <w:pPr>
-      <w:spacing w:after="160" w:line="278" w:lineRule="auto"/>
-    </w:pPr>
-    <w:rPr>
-      <w:kern w:val="2"/>
-      <w:sz w:val="24"/>
-      <w:szCs w:val="24"/>
-      <w:lang w:val="es-MX" w:eastAsia="es-MX"/>
-      <w14:ligatures w14:val="standardContextual"/>
-    </w:rPr>
-  </w:style>
-  <w:style w:type="paragraph" w:customStyle="1" w:styleId="37B4E9EC84524441806A72543E6EB776">
-    <w:name w:val="37B4E9EC84524441806A72543E6EB776"/>
-    <w:rsid w:val="00F9701E"/>
-    <w:pPr>
-      <w:spacing w:after="160" w:line="278" w:lineRule="auto"/>
-    </w:pPr>
-    <w:rPr>
-      <w:kern w:val="2"/>
-      <w:sz w:val="24"/>
-      <w:szCs w:val="24"/>
-      <w:lang w:val="es-MX" w:eastAsia="es-MX"/>
-      <w14:ligatures w14:val="standardContextual"/>
-    </w:rPr>
-  </w:style>
   <w:style w:type="paragraph" w:customStyle="1" w:styleId="C640D499FC2C4D8BB7EE0865A4DFC150">
     <w:name w:val="C640D499FC2C4D8BB7EE0865A4DFC150"/>
     <w:rsid w:val="00F9701E"/>
@@ -47445,33 +47624,6 @@
   <w:style w:type="paragraph" w:customStyle="1" w:styleId="135EF6A4B59D471BBBDA9018016FC0D4">
     <w:name w:val="135EF6A4B59D471BBBDA9018016FC0D4"/>
     <w:rsid w:val="0041363B"/>
-    <w:rPr>
-      <w:lang w:val="es-ES" w:eastAsia="es-ES"/>
-    </w:rPr>
-  </w:style>
-  <w:style w:type="paragraph" w:customStyle="1" w:styleId="D4D748F144104FF4BD4EBC6004D7E1B2">
-    <w:name w:val="D4D748F144104FF4BD4EBC6004D7E1B2"/>
-    <w:rsid w:val="0041363B"/>
-    <w:rPr>
-      <w:lang w:val="es-ES" w:eastAsia="es-ES"/>
-    </w:rPr>
-  </w:style>
-  <w:style w:type="paragraph" w:customStyle="1" w:styleId="348A482B056E400F81165453B4752799">
-    <w:name w:val="348A482B056E400F81165453B4752799"/>
-    <w:rsid w:val="002D0409"/>
-    <w:pPr>
-      <w:spacing w:after="160" w:line="259" w:lineRule="auto"/>
-    </w:pPr>
-    <w:rPr>
-      <w:lang w:val="es-ES" w:eastAsia="es-ES"/>
-    </w:rPr>
-  </w:style>
-  <w:style w:type="paragraph" w:customStyle="1" w:styleId="8EB4E12CEBFF405F87E35551C4A576CD">
-    <w:name w:val="8EB4E12CEBFF405F87E35551C4A576CD"/>
-    <w:rsid w:val="002D0409"/>
-    <w:pPr>
-      <w:spacing w:after="160" w:line="259" w:lineRule="auto"/>
-    </w:pPr>
     <w:rPr>
       <w:lang w:val="es-ES" w:eastAsia="es-ES"/>
     </w:rPr>
@@ -47891,33 +48043,6 @@
 </file>
 
 <file path=customXml/item3.xml><?xml version="1.0" encoding="utf-8"?>
-<b:Sources xmlns:b="http://schemas.openxmlformats.org/officeDocument/2006/bibliography" xmlns="http://schemas.openxmlformats.org/officeDocument/2006/bibliography" SelectedStyle="\APA.XSL" StyleName="APA"/>
-</file>
-
-<file path=customXml/item4.xml><?xml version="1.0" encoding="utf-8"?>
-<EurolookProperties>
-  <ProductCustomizationId/>
-  <Created>
-    <Version>4.1</Version>
-    <Date>2020-03-20T16:52:08</Date>
-    <Language>EN</Language>
-    <Note/>
-  </Created>
-  <Edited>
-    <Version>10.0.41789.0</Version>
-    <Date>2021-02-19T10:04:48</Date>
-  </Edited>
-  <DocumentModel>
-    <Id>34954475-997f-4cb0-a95b-7f65298f3d8c</Id>
-    <Name>Report (long)</Name>
-  </DocumentModel>
-  <DocumentDate>2007-11-20T00:00:00</DocumentDate>
-  <DocumentVersion/>
-  <CompatibilityMode>Eurolook4X</CompatibilityMode>
-</EurolookProperties>
-</file>
-
-<file path=customXml/item5.xml><?xml version="1.0" encoding="utf-8"?>
 <Texts>
   <SecurityPharma>Pharma Investigations</SecurityPharma>
   <MarkingUntilText>UNTIL</MarkingUntilText>
@@ -47988,6 +48113,33 @@
 </Texts>
 </file>
 
+<file path=customXml/item4.xml><?xml version="1.0" encoding="utf-8"?>
+<EurolookProperties>
+  <ProductCustomizationId/>
+  <Created>
+    <Version>4.1</Version>
+    <Date>2020-03-20T16:52:08</Date>
+    <Language>EN</Language>
+    <Note/>
+  </Created>
+  <Edited>
+    <Version>10.0.41789.0</Version>
+    <Date>2021-02-19T10:04:48</Date>
+  </Edited>
+  <DocumentModel>
+    <Id>34954475-997f-4cb0-a95b-7f65298f3d8c</Id>
+    <Name>Report (long)</Name>
+  </DocumentModel>
+  <DocumentDate>2007-11-20T00:00:00</DocumentDate>
+  <DocumentVersion/>
+  <CompatibilityMode>Eurolook4X</CompatibilityMode>
+</EurolookProperties>
+</file>
+
+<file path=customXml/item5.xml><?xml version="1.0" encoding="utf-8"?>
+<b:Sources xmlns:b="http://schemas.openxmlformats.org/officeDocument/2006/bibliography" xmlns="http://schemas.openxmlformats.org/officeDocument/2006/bibliography" SelectedStyle="\APA.XSL" StyleName="APA"/>
+</file>
+
 <file path=customXml/itemProps1.xml><?xml version="1.0" encoding="utf-8"?>
 <ds:datastoreItem xmlns:ds="http://schemas.openxmlformats.org/officeDocument/2006/customXml" ds:itemID="{55AF091B-3C7A-41E3-B477-F2FDAA23CFDA}">
   <ds:schemaRefs>
@@ -48003,10 +48155,8 @@
 </file>
 
 <file path=customXml/itemProps3.xml><?xml version="1.0" encoding="utf-8"?>
-<ds:datastoreItem xmlns:ds="http://schemas.openxmlformats.org/officeDocument/2006/customXml" ds:itemID="{CC073F00-BBB8-412C-9258-80E82D210F6D}">
-  <ds:schemaRefs>
-    <ds:schemaRef ds:uri="http://schemas.openxmlformats.org/officeDocument/2006/bibliography"/>
-  </ds:schemaRefs>
+<ds:datastoreItem xmlns:ds="http://schemas.openxmlformats.org/officeDocument/2006/customXml" ds:itemID="{A6E6B933-4A3B-44E1-ADE6-B5082144D3CC}">
+  <ds:schemaRefs/>
 </ds:datastoreItem>
 </file>
 
@@ -48017,7 +48167,9 @@
 </file>
 
 <file path=customXml/itemProps5.xml><?xml version="1.0" encoding="utf-8"?>
-<ds:datastoreItem xmlns:ds="http://schemas.openxmlformats.org/officeDocument/2006/customXml" ds:itemID="{A6E6B933-4A3B-44E1-ADE6-B5082144D3CC}">
-  <ds:schemaRefs/>
+<ds:datastoreItem xmlns:ds="http://schemas.openxmlformats.org/officeDocument/2006/customXml" ds:itemID="{CC073F00-BBB8-412C-9258-80E82D210F6D}">
+  <ds:schemaRefs>
+    <ds:schemaRef ds:uri="http://schemas.openxmlformats.org/officeDocument/2006/bibliography"/>
+  </ds:schemaRefs>
 </ds:datastoreItem>
 </file>
</xml_diff>

<commit_message>
Conclusiones agregadas al archivo de Gestion de Comunicacion y Seguimiento
</commit_message>
<xml_diff>
--- a/Administracion/Documentacion/ES (OPM2-16.P.TPL.v3.0.1).Plan_de_Gestion_de_la_Comunicacion.(CyberSentinel).(11-05-2026).(v.1.0.0).docx
+++ b/Administracion/Documentacion/ES (OPM2-16.P.TPL.v3.0.1).Plan_de_Gestion_de_la_Comunicacion.(CyberSentinel).(11-05-2026).(v.1.0.0).docx
@@ -22,7 +22,7 @@
           <w:noProof/>
         </w:rPr>
         <w:drawing>
-          <wp:inline distT="0" distB="0" distL="0" distR="0" wp14:anchorId="3F5954AE" wp14:editId="19661667">
+          <wp:inline distT="0" distB="0" distL="0" distR="0" wp14:anchorId="3F5954AE" wp14:editId="5E42B8E5">
             <wp:extent cx="1238250" cy="893737"/>
             <wp:effectExtent l="0" t="0" r="0" b="1905"/>
             <wp:docPr id="2048987212" name="Imagen 4"/>
@@ -2896,7 +2896,16 @@
                 <w:sz w:val="20"/>
                 <w:szCs w:val="22"/>
               </w:rPr>
-              <w:t>08/05/2026</w:t>
+              <w:t>11</w:t>
+            </w:r>
+            <w:r>
+              <w:rPr>
+                <w:rFonts w:asciiTheme="minorHAnsi" w:eastAsia="PMingLiU" w:hAnsiTheme="minorHAnsi" w:cstheme="minorHAnsi"/>
+                <w:color w:val="000000" w:themeColor="text1"/>
+                <w:sz w:val="20"/>
+                <w:szCs w:val="22"/>
+              </w:rPr>
+              <w:t>/05/2026</w:t>
             </w:r>
           </w:p>
         </w:tc>
@@ -31312,8 +31321,9 @@
                 <w:color w:val="1B6FB5"/>
                 <w:lang w:val="es-ES"/>
               </w:rPr>
-              <w:t>&lt;</w:t>
-            </w:r>
+              <w:t>1 vez a la semana (</w:t>
+            </w:r>
+            <w:proofErr w:type="gramStart"/>
             <w:r>
               <w:rPr>
                 <w:rFonts w:ascii="Calibri" w:hAnsi="Calibri" w:cs="Times New Roman"/>
@@ -31321,8 +31331,9 @@
                 <w:color w:val="1B6FB5"/>
                 <w:lang w:val="es-ES"/>
               </w:rPr>
-              <w:t>La frecuencia de la reunión (+ día de la semana) se definirá aquí</w:t>
-            </w:r>
+              <w:t>Lunes</w:t>
+            </w:r>
+            <w:proofErr w:type="gramEnd"/>
             <w:r>
               <w:rPr>
                 <w:rFonts w:ascii="Calibri" w:hAnsi="Calibri" w:cs="Times New Roman"/>
@@ -31330,16 +31341,7 @@
                 <w:color w:val="1B6FB5"/>
                 <w:lang w:val="es-ES"/>
               </w:rPr>
-              <w:t>.</w:t>
-            </w:r>
-            <w:r>
-              <w:rPr>
-                <w:rFonts w:ascii="Calibri" w:hAnsi="Calibri" w:cs="Times New Roman"/>
-                <w:iCs w:val="0"/>
-                <w:color w:val="1B6FB5"/>
-                <w:lang w:val="es-ES"/>
-              </w:rPr>
-              <w:t>&gt;</w:t>
+              <w:t>)</w:t>
             </w:r>
           </w:p>
         </w:tc>
@@ -31553,37 +31555,77 @@
               <w:rPr>
                 <w:rFonts w:ascii="Calibri" w:hAnsi="Calibri" w:cs="Times New Roman"/>
                 <w:iCs w:val="0"/>
-                <w:color w:val="1B6FB5"/>
-                <w:lang w:val="es-ES"/>
-              </w:rPr>
-              <w:t>&lt;</w:t>
-            </w:r>
-            <w:r>
-              <w:rPr>
-                <w:rFonts w:ascii="Calibri" w:hAnsi="Calibri" w:cs="Times New Roman"/>
-                <w:iCs w:val="0"/>
-                <w:color w:val="1B6FB5"/>
-                <w:lang w:val="es-ES"/>
-              </w:rPr>
-              <w:t>La frecuencia de la reunión (+ día de la semana) se definirá aquí</w:t>
-            </w:r>
-            <w:r>
-              <w:rPr>
-                <w:rFonts w:ascii="Calibri" w:hAnsi="Calibri" w:cs="Times New Roman"/>
-                <w:iCs w:val="0"/>
-                <w:color w:val="1B6FB5"/>
-                <w:lang w:val="es-ES"/>
-              </w:rPr>
-              <w:t>.</w:t>
-            </w:r>
-            <w:r>
-              <w:rPr>
-                <w:rFonts w:ascii="Calibri" w:hAnsi="Calibri" w:cs="Times New Roman"/>
-                <w:iCs w:val="0"/>
-                <w:color w:val="1B6FB5"/>
-                <w:lang w:val="es-ES"/>
-              </w:rPr>
-              <w:t>&gt;</w:t>
+                <w:sz w:val="22"/>
+                <w:szCs w:val="22"/>
+                <w:lang w:val="es-ES"/>
+              </w:rPr>
+              <w:t>3 veces a la semana (</w:t>
+            </w:r>
+            <w:proofErr w:type="gramStart"/>
+            <w:r>
+              <w:rPr>
+                <w:rFonts w:ascii="Calibri" w:hAnsi="Calibri" w:cs="Times New Roman"/>
+                <w:iCs w:val="0"/>
+                <w:sz w:val="22"/>
+                <w:szCs w:val="22"/>
+                <w:lang w:val="es-ES"/>
+              </w:rPr>
+              <w:t>Lunes</w:t>
+            </w:r>
+            <w:proofErr w:type="gramEnd"/>
+            <w:r>
+              <w:rPr>
+                <w:rFonts w:ascii="Calibri" w:hAnsi="Calibri" w:cs="Times New Roman"/>
+                <w:iCs w:val="0"/>
+                <w:sz w:val="22"/>
+                <w:szCs w:val="22"/>
+                <w:lang w:val="es-ES"/>
+              </w:rPr>
+              <w:t xml:space="preserve">, </w:t>
+            </w:r>
+            <w:proofErr w:type="gramStart"/>
+            <w:r>
+              <w:rPr>
+                <w:rFonts w:ascii="Calibri" w:hAnsi="Calibri" w:cs="Times New Roman"/>
+                <w:iCs w:val="0"/>
+                <w:sz w:val="22"/>
+                <w:szCs w:val="22"/>
+                <w:lang w:val="es-ES"/>
+              </w:rPr>
+              <w:t>Miércoles</w:t>
+            </w:r>
+            <w:proofErr w:type="gramEnd"/>
+            <w:r>
+              <w:rPr>
+                <w:rFonts w:ascii="Calibri" w:hAnsi="Calibri" w:cs="Times New Roman"/>
+                <w:iCs w:val="0"/>
+                <w:sz w:val="22"/>
+                <w:szCs w:val="22"/>
+                <w:lang w:val="es-ES"/>
+              </w:rPr>
+              <w:t xml:space="preserve"> y </w:t>
+            </w:r>
+            <w:proofErr w:type="gramStart"/>
+            <w:r>
+              <w:rPr>
+                <w:rFonts w:ascii="Calibri" w:hAnsi="Calibri" w:cs="Times New Roman"/>
+                <w:iCs w:val="0"/>
+                <w:sz w:val="22"/>
+                <w:szCs w:val="22"/>
+                <w:lang w:val="es-ES"/>
+              </w:rPr>
+              <w:t>Jueves</w:t>
+            </w:r>
+            <w:proofErr w:type="gramEnd"/>
+            <w:r>
+              <w:rPr>
+                <w:rFonts w:ascii="Calibri" w:hAnsi="Calibri" w:cs="Times New Roman"/>
+                <w:iCs w:val="0"/>
+                <w:sz w:val="22"/>
+                <w:szCs w:val="22"/>
+                <w:lang w:val="es-ES"/>
+              </w:rPr>
+              <w:t>)</w:t>
             </w:r>
           </w:p>
         </w:tc>
@@ -33179,16 +33221,16 @@
                 <w:color w:val="1B6FB5"/>
                 <w:lang w:val="es-ES"/>
               </w:rPr>
-              <w:t>&lt;</w:t>
+              <w:t>1 vez al d</w:t>
             </w:r>
             <w:r>
               <w:rPr>
                 <w:rFonts w:ascii="Calibri" w:hAnsi="Calibri" w:cs="Times New Roman"/>
                 <w:iCs w:val="0"/>
                 <w:color w:val="1B6FB5"/>
-                <w:lang w:val="es-ES"/>
-              </w:rPr>
-              <w:t>La frecuencia de la reunión (+ día de la semana) se definirá aquí</w:t>
+                <w:lang w:val="es-419"/>
+              </w:rPr>
+              <w:t>í</w:t>
             </w:r>
             <w:r>
               <w:rPr>
@@ -33197,16 +33239,7 @@
                 <w:color w:val="1B6FB5"/>
                 <w:lang w:val="es-ES"/>
               </w:rPr>
-              <w:t>.</w:t>
-            </w:r>
-            <w:r>
-              <w:rPr>
-                <w:rFonts w:ascii="Calibri" w:hAnsi="Calibri" w:cs="Times New Roman"/>
-                <w:iCs w:val="0"/>
-                <w:color w:val="1B6FB5"/>
-                <w:lang w:val="es-ES"/>
-              </w:rPr>
-              <w:t>&gt;</w:t>
+              <w:t>a</w:t>
             </w:r>
           </w:p>
         </w:tc>
@@ -36607,10 +36640,193 @@
     </w:p>
     <w:p>
       <w:pPr>
-        <w:rPr>
-          <w:rFonts w:ascii="Calibri" w:hAnsi="Calibri"/>
-        </w:rPr>
-      </w:pPr>
+        <w:pStyle w:val="Ttulo1"/>
+      </w:pPr>
+      <w:r>
+        <w:t>Conclusiones:</w:t>
+      </w:r>
+    </w:p>
+    <w:p>
+      <w:pPr>
+        <w:rPr>
+          <w:rFonts w:ascii="Calibri" w:hAnsi="Calibri"/>
+          <w:b/>
+          <w:bCs/>
+          <w:lang w:val="es-MX"/>
+        </w:rPr>
+      </w:pPr>
+      <w:r>
+        <w:rPr>
+          <w:rFonts w:ascii="Calibri" w:hAnsi="Calibri"/>
+          <w:b/>
+          <w:bCs/>
+          <w:lang w:val="es-MX"/>
+        </w:rPr>
+        <w:t>Hernández Heredia Kevin</w:t>
+      </w:r>
+    </w:p>
+    <w:p>
+      <w:pPr>
+        <w:rPr>
+          <w:rFonts w:ascii="Calibri" w:hAnsi="Calibri"/>
+          <w:lang w:val="es-MX"/>
+        </w:rPr>
+      </w:pPr>
+      <w:r>
+        <w:rPr>
+          <w:rFonts w:ascii="Calibri" w:hAnsi="Calibri"/>
+          <w:lang w:val="es-MX"/>
+        </w:rPr>
+        <w:t xml:space="preserve">La elaboración del plan de gestión de comunicación y seguimiento permitió comprender la importancia de mantener una comunicación clara, organizada y constante dentro de un proyecto de software. Durante el desarrollo de esta actividad se identificó que herramientas como GitHub </w:t>
+      </w:r>
+      <w:proofErr w:type="spellStart"/>
+      <w:r>
+        <w:rPr>
+          <w:rFonts w:ascii="Calibri" w:hAnsi="Calibri"/>
+          <w:lang w:val="es-MX"/>
+        </w:rPr>
+        <w:t>Projects</w:t>
+      </w:r>
+      <w:proofErr w:type="spellEnd"/>
+      <w:r>
+        <w:rPr>
+          <w:rFonts w:ascii="Calibri" w:hAnsi="Calibri"/>
+          <w:lang w:val="es-MX"/>
+        </w:rPr>
+        <w:t xml:space="preserve"> y </w:t>
+      </w:r>
+      <w:proofErr w:type="spellStart"/>
+      <w:r>
+        <w:rPr>
+          <w:rFonts w:ascii="Calibri" w:hAnsi="Calibri"/>
+          <w:lang w:val="es-MX"/>
+        </w:rPr>
+        <w:t>ClickUp</w:t>
+      </w:r>
+      <w:proofErr w:type="spellEnd"/>
+      <w:r>
+        <w:rPr>
+          <w:rFonts w:ascii="Calibri" w:hAnsi="Calibri"/>
+          <w:lang w:val="es-MX"/>
+        </w:rPr>
+        <w:t xml:space="preserve"> facilitan el seguimiento de actividades, la coordinación del equipo y el control del avance del proyecto. Además, se logró entender cómo una buena gestión de la comunicación contribuye a reducir errores, mejorar la toma de decisiones y mantener alineados los objetivos del proyecto </w:t>
+      </w:r>
+      <w:proofErr w:type="spellStart"/>
+      <w:r>
+        <w:rPr>
+          <w:rFonts w:ascii="Calibri" w:hAnsi="Calibri"/>
+          <w:lang w:val="es-MX"/>
+        </w:rPr>
+        <w:t>CyberSentinel</w:t>
+      </w:r>
+      <w:proofErr w:type="spellEnd"/>
+      <w:r>
+        <w:rPr>
+          <w:rFonts w:ascii="Calibri" w:hAnsi="Calibri"/>
+          <w:lang w:val="es-MX"/>
+        </w:rPr>
+        <w:t>.</w:t>
+      </w:r>
+    </w:p>
+    <w:p>
+      <w:pPr>
+        <w:rPr>
+          <w:rFonts w:ascii="Calibri" w:hAnsi="Calibri"/>
+          <w:lang w:val="es-MX"/>
+        </w:rPr>
+      </w:pPr>
+    </w:p>
+    <w:p>
+      <w:pPr>
+        <w:rPr>
+          <w:rFonts w:ascii="Calibri" w:hAnsi="Calibri"/>
+          <w:b/>
+          <w:bCs/>
+          <w:lang w:val="es-MX"/>
+        </w:rPr>
+      </w:pPr>
+      <w:r>
+        <w:rPr>
+          <w:rFonts w:ascii="Calibri" w:hAnsi="Calibri"/>
+          <w:b/>
+          <w:bCs/>
+          <w:lang w:val="es-MX"/>
+        </w:rPr>
+        <w:t>Hernández Rodríguez Oscar Ariel</w:t>
+      </w:r>
+    </w:p>
+    <w:p>
+      <w:pPr>
+        <w:rPr>
+          <w:rFonts w:ascii="Calibri" w:hAnsi="Calibri"/>
+          <w:lang w:val="es-MX"/>
+        </w:rPr>
+      </w:pPr>
+      <w:r>
+        <w:rPr>
+          <w:rFonts w:ascii="Calibri" w:hAnsi="Calibri"/>
+          <w:lang w:val="es-MX"/>
+        </w:rPr>
+        <w:t>El desarrollo de este documento permitió analizar cómo la comunicación influye directamente en la eficiencia y organización de un proyecto tecnológico. Se comprendió la importancia de definir lineamientos, canales y tipos de comunicación adecuados para mantener un flujo de información efectivo entre todos los integrantes del equipo. Asimismo, el uso de herramientas digitales de gestión ayudó a visualizar de mejor manera las actividades y el progreso del proyecto, facilitando el trabajo colaborativo y el seguimiento continuo de las tareas.</w:t>
+      </w:r>
+    </w:p>
+    <w:p>
+      <w:pPr>
+        <w:rPr>
+          <w:rFonts w:ascii="Calibri" w:hAnsi="Calibri"/>
+          <w:lang w:val="es-MX"/>
+        </w:rPr>
+      </w:pPr>
+    </w:p>
+    <w:p>
+      <w:pPr>
+        <w:rPr>
+          <w:rFonts w:ascii="Calibri" w:hAnsi="Calibri"/>
+          <w:b/>
+          <w:bCs/>
+          <w:lang w:val="es-MX"/>
+        </w:rPr>
+      </w:pPr>
+      <w:r>
+        <w:rPr>
+          <w:rFonts w:ascii="Calibri" w:hAnsi="Calibri"/>
+          <w:b/>
+          <w:bCs/>
+          <w:lang w:val="es-MX"/>
+        </w:rPr>
+        <w:t>Santiago Mendoza Abraham</w:t>
+      </w:r>
+    </w:p>
+    <w:p>
+      <w:pPr>
+        <w:rPr>
+          <w:rFonts w:ascii="Calibri" w:hAnsi="Calibri"/>
+          <w:lang w:val="es-MX"/>
+        </w:rPr>
+      </w:pPr>
+      <w:r>
+        <w:rPr>
+          <w:rFonts w:ascii="Calibri" w:hAnsi="Calibri"/>
+          <w:lang w:val="es-MX"/>
+        </w:rPr>
+        <w:t xml:space="preserve">La gestión de comunicación y seguimiento realizada para el proyecto </w:t>
+      </w:r>
+      <w:proofErr w:type="spellStart"/>
+      <w:r>
+        <w:rPr>
+          <w:rFonts w:ascii="Calibri" w:hAnsi="Calibri"/>
+          <w:lang w:val="es-MX"/>
+        </w:rPr>
+        <w:t>CyberSentinel</w:t>
+      </w:r>
+      <w:proofErr w:type="spellEnd"/>
+      <w:r>
+        <w:rPr>
+          <w:rFonts w:ascii="Calibri" w:hAnsi="Calibri"/>
+          <w:lang w:val="es-MX"/>
+        </w:rPr>
+        <w:t xml:space="preserve"> permitió identificar la relevancia de documentar y controlar adecuadamente la información durante todas las etapas del desarrollo. Gracias a esta actividad se comprendió que una comunicación efectiva no solo mejora la coordinación del equipo, sino que también ayuda a prevenir riesgos, retrasos y problemas organizacionales. Además, se reconoció la importancia de utilizar plataformas digitales y metodologías de seguimiento para mantener un mejor control del proyecto y asegurar el cumplimiento de los objetivos establecidos.</w:t>
+      </w:r>
     </w:p>
     <w:sectPr>
       <w:headerReference w:type="even" r:id="rId26"/>
@@ -44648,7 +44864,6 @@
   <w:style w:type="character" w:default="1" w:styleId="Fuentedeprrafopredeter">
     <w:name w:val="Default Paragraph Font"/>
     <w:uiPriority w:val="1"/>
-    <w:semiHidden/>
     <w:unhideWhenUsed/>
   </w:style>
   <w:style w:type="table" w:default="1" w:styleId="Tablanormal">
@@ -46980,7 +47195,6 @@
     <w:sig w:usb0="E1002EFF" w:usb1="C000605B" w:usb2="00000029" w:usb3="00000000" w:csb0="000101FF" w:csb1="00000000"/>
   </w:font>
   <w:font w:name="PMingLiU">
-    <w:altName w:val="新細明體"/>
     <w:panose1 w:val="02010601000101010101"/>
     <w:charset w:val="88"/>
     <w:family w:val="roman"/>
@@ -47056,6 +47270,7 @@
     <w:rsid w:val="004B3772"/>
     <w:rsid w:val="004B48E8"/>
     <w:rsid w:val="004C219A"/>
+    <w:rsid w:val="00503EF0"/>
     <w:rsid w:val="00512AC7"/>
     <w:rsid w:val="00532D79"/>
     <w:rsid w:val="00586907"/>
@@ -47064,12 +47279,15 @@
     <w:rsid w:val="00621CF0"/>
     <w:rsid w:val="00634268"/>
     <w:rsid w:val="00793BAD"/>
+    <w:rsid w:val="00805B30"/>
+    <w:rsid w:val="00844F5F"/>
     <w:rsid w:val="00857C18"/>
     <w:rsid w:val="008937F6"/>
     <w:rsid w:val="00895B5D"/>
     <w:rsid w:val="008C2F71"/>
     <w:rsid w:val="009865D7"/>
     <w:rsid w:val="009B0EA8"/>
+    <w:rsid w:val="009D5FFA"/>
     <w:rsid w:val="00A96DB1"/>
     <w:rsid w:val="00AE4E42"/>
     <w:rsid w:val="00B61866"/>

</xml_diff>